<commit_message>
Standardize Python env to .venv, remove tracked venv/.env, add VS Code settings and requirements
</commit_message>
<xml_diff>
--- a/data/raw/mevzuat/1.5.1475.docx
+++ b/data/raw/mevzuat/1.5.1475.docx
@@ -1,469 +1,32 @@
 
 <file path=word/document.xml><?xml version="1.0" encoding="utf-8"?>
-<w:document xmlns:wpc="http://schemas.microsoft.com/office/word/2010/wordprocessingCanvas" xmlns:cx="http://schemas.microsoft.com/office/drawing/2014/chartex" xmlns:cx1="http://schemas.microsoft.com/office/drawing/2015/9/8/chartex" xmlns:cx2="http://schemas.microsoft.com/office/drawing/2015/10/21/chartex" xmlns:cx3="http://schemas.microsoft.com/office/drawing/2016/5/9/chartex" xmlns:cx4="http://schemas.microsoft.com/office/drawing/2016/5/10/chartex" xmlns:cx5="http://schemas.microsoft.com/office/drawing/2016/5/11/chartex" xmlns:cx6="http://schemas.microsoft.com/office/drawing/2016/5/12/chartex" xmlns:cx7="http://schemas.microsoft.com/office/drawing/2016/5/13/chartex" xmlns:cx8="http://schemas.microsoft.com/office/drawing/2016/5/14/chartex" xmlns:mc="http://schemas.openxmlformats.org/markup-compatibility/2006" xmlns:aink="http://schemas.microsoft.com/office/drawing/2016/ink" xmlns:am3d="http://schemas.microsoft.com/office/drawing/2017/model3d" xmlns:o="urn:schemas-microsoft-com:office:office" xmlns:oel="http://schemas.microsoft.com/office/2019/extlst" xmlns:r="http://schemas.openxmlformats.org/officeDocument/2006/relationships" xmlns:m="http://schemas.openxmlformats.org/officeDocument/2006/math" xmlns:v="urn:schemas-microsoft-com:vml" xmlns:wp14="http://schemas.microsoft.com/office/word/2010/wordprocessingDrawing" xmlns:wp="http://schemas.openxmlformats.org/drawingml/2006/wordprocessingDrawing" xmlns:w10="urn:schemas-microsoft-com:office:word" xmlns:w="http://schemas.openxmlformats.org/wordprocessingml/2006/main" xmlns:w14="http://schemas.microsoft.com/office/word/2010/wordml" xmlns:w15="http://schemas.microsoft.com/office/word/2012/wordml" xmlns:w16cex="http://schemas.microsoft.com/office/word/2018/wordml/cex" xmlns:w16cid="http://schemas.microsoft.com/office/word/2016/wordml/cid" xmlns:w16="http://schemas.microsoft.com/office/word/2018/wordml" xmlns:w16du="http://schemas.microsoft.com/office/word/2023/wordml/word16du" xmlns:w16sdtdh="http://schemas.microsoft.com/office/word/2020/wordml/sdtdatahash" xmlns:w16sdtfl="http://schemas.microsoft.com/office/word/2024/wordml/sdtformatlock" xmlns:w16se="http://schemas.microsoft.com/office/word/2015/wordml/symex" xmlns:wpg="http://schemas.microsoft.com/office/word/2010/wordprocessingGroup" xmlns:wpi="http://schemas.microsoft.com/office/word/2010/wordprocessingInk" xmlns:wne="http://schemas.microsoft.com/office/word/2006/wordml" xmlns:wps="http://schemas.microsoft.com/office/word/2010/wordprocessingShape" mc:Ignorable="w14 w15 w16se w16cid w16 w16cex w16sdtdh w16sdtfl w16du wp14">
+<w:document xmlns:wpc="http://schemas.microsoft.com/office/word/2010/wordprocessingCanvas" xmlns:cx="http://schemas.microsoft.com/office/drawing/2014/chartex" xmlns:cx1="http://schemas.microsoft.com/office/drawing/2015/9/8/chartex" xmlns:cx2="http://schemas.microsoft.com/office/drawing/2015/10/21/chartex" xmlns:cx3="http://schemas.microsoft.com/office/drawing/2016/5/9/chartex" xmlns:cx4="http://schemas.microsoft.com/office/drawing/2016/5/10/chartex" xmlns:cx5="http://schemas.microsoft.com/office/drawing/2016/5/11/chartex" xmlns:cx6="http://schemas.microsoft.com/office/drawing/2016/5/12/chartex" xmlns:cx7="http://schemas.microsoft.com/office/drawing/2016/5/13/chartex" xmlns:cx8="http://schemas.microsoft.com/office/drawing/2016/5/14/chartex" xmlns:mc="http://schemas.openxmlformats.org/markup-compatibility/2006" xmlns:aink="http://schemas.microsoft.com/office/drawing/2016/ink" xmlns:am3d="http://schemas.microsoft.com/office/drawing/2017/model3d" xmlns:o="urn:schemas-microsoft-com:office:office" xmlns:oel="http://schemas.microsoft.com/office/2019/extlst" xmlns:r="http://schemas.openxmlformats.org/officeDocument/2006/relationships" xmlns:m="http://schemas.openxmlformats.org/officeDocument/2006/math" xmlns:v="urn:schemas-microsoft-com:vml" xmlns:wp14="http://schemas.microsoft.com/office/word/2010/wordprocessingDrawing" xmlns:wp="http://schemas.openxmlformats.org/drawingml/2006/wordprocessingDrawing" xmlns:w10="urn:schemas-microsoft-com:office:word" xmlns:w="http://schemas.openxmlformats.org/wordprocessingml/2006/main" xmlns:w14="http://schemas.microsoft.com/office/word/2010/wordml" xmlns:w15="http://schemas.microsoft.com/office/word/2012/wordml" xmlns:w16cex="http://schemas.microsoft.com/office/word/2018/wordml/cex" xmlns:w16cid="http://schemas.microsoft.com/office/word/2016/wordml/cid" xmlns:w16="http://schemas.microsoft.com/office/word/2018/wordml" xmlns:w16sdtdh="http://schemas.microsoft.com/office/word/2020/wordml/sdtdatahash" xmlns:w16se="http://schemas.microsoft.com/office/word/2015/wordml/symex" xmlns:wpg="http://schemas.microsoft.com/office/word/2010/wordprocessingGroup" xmlns:wpi="http://schemas.microsoft.com/office/word/2010/wordprocessingInk" xmlns:wne="http://schemas.microsoft.com/office/word/2006/wordml" xmlns:wps="http://schemas.microsoft.com/office/word/2010/wordprocessingShape" mc:Ignorable="w14 w15 w16se w16cid w16 w16cex w16sdtdh wp14">
   <w:body>
     <w:p>
       <w:pPr>
         <w:widowControl w:val="0"/>
         <w:tabs>
-          <w:tab w:val="center" w:pos="3543"/>
+          <w:tab w:val="left" w:pos="567"/>
         </w:tabs>
         <w:adjustRightInd w:val="0"/>
         <w:spacing w:line="302" w:lineRule="auto"/>
-        <w:jc w:val="center"/>
-        <w:textAlignment w:val="baseline"/>
-        <w:rPr>
-          <w:b/>
-          <w:sz w:val="24"/>
-          <w:szCs w:val="24"/>
-        </w:rPr>
-      </w:pPr>
-      <w:bookmarkStart w:id="0" w:name="K21"/>
-      <w:bookmarkEnd w:id="0"/>
-    </w:p>
-    <w:p>
-      <w:pPr>
-        <w:widowControl w:val="0"/>
-        <w:tabs>
-          <w:tab w:val="center" w:pos="3543"/>
+        <w:jc w:val="both"/>
+        <w:textAlignment w:val="baseline"/>
+        <w:rPr>
+          <w:i/>
+          <w:sz w:val="24"/>
+          <w:szCs w:val="24"/>
+        </w:rPr>
+      </w:pPr>
+    </w:p>
+    <w:p>
+      <w:pPr>
+        <w:widowControl w:val="0"/>
+        <w:tabs>
+          <w:tab w:val="left" w:pos="567"/>
         </w:tabs>
         <w:adjustRightInd w:val="0"/>
         <w:spacing w:line="302" w:lineRule="auto"/>
-        <w:jc w:val="center"/>
-        <w:textAlignment w:val="baseline"/>
-        <w:rPr>
-          <w:b/>
-          <w:sz w:val="24"/>
-          <w:szCs w:val="24"/>
-        </w:rPr>
-      </w:pPr>
-      <w:r>
-        <w:rPr>
-          <w:b/>
-          <w:sz w:val="24"/>
-          <w:szCs w:val="24"/>
-        </w:rPr>
-        <w:t>İ</w:t>
-      </w:r>
-      <w:r>
-        <w:rPr>
-          <w:b/>
-          <w:sz w:val="24"/>
-          <w:szCs w:val="24"/>
-        </w:rPr>
-        <w:t>Ş KANUNU</w:t>
-      </w:r>
-      <w:r>
-        <w:rPr>
-          <w:rStyle w:val="DipnotBavurusu"/>
-          <w:sz w:val="24"/>
-          <w:szCs w:val="24"/>
-        </w:rPr>
-        <w:footnoteReference w:id="1"/>
-      </w:r>
-    </w:p>
-    <w:p>
-      <w:pPr>
-        <w:widowControl w:val="0"/>
-        <w:tabs>
-          <w:tab w:val="left" w:pos="567"/>
-        </w:tabs>
-        <w:adjustRightInd w:val="0"/>
-        <w:spacing w:line="302" w:lineRule="auto"/>
-        <w:jc w:val="center"/>
-        <w:textAlignment w:val="baseline"/>
-        <w:rPr>
-          <w:sz w:val="24"/>
-          <w:szCs w:val="24"/>
-        </w:rPr>
-      </w:pPr>
-    </w:p>
-    <w:p>
-      <w:pPr>
-        <w:widowControl w:val="0"/>
-        <w:tabs>
-          <w:tab w:val="left" w:pos="3686"/>
-          <w:tab w:val="left" w:pos="4536"/>
-          <w:tab w:val="left" w:pos="4678"/>
-          <w:tab w:val="left" w:pos="6096"/>
-          <w:tab w:val="left" w:pos="6663"/>
-          <w:tab w:val="left" w:pos="7797"/>
-          <w:tab w:val="right" w:pos="9070"/>
-        </w:tabs>
-        <w:adjustRightInd w:val="0"/>
-        <w:spacing w:line="302" w:lineRule="auto"/>
-        <w:ind w:firstLine="709"/>
-        <w:jc w:val="both"/>
-        <w:textAlignment w:val="baseline"/>
-        <w:rPr>
-          <w:b/>
-          <w:sz w:val="24"/>
-          <w:szCs w:val="24"/>
-        </w:rPr>
-      </w:pPr>
-      <w:r>
-        <w:rPr>
-          <w:b/>
-          <w:sz w:val="24"/>
-          <w:szCs w:val="24"/>
-        </w:rPr>
-        <w:t>Kanun Numarası</w:t>
-      </w:r>
-      <w:r>
-        <w:rPr>
-          <w:b/>
-          <w:sz w:val="24"/>
-          <w:szCs w:val="24"/>
-        </w:rPr>
-        <w:tab/>
-        <w:t>: 1475</w:t>
-      </w:r>
-    </w:p>
-    <w:p>
-      <w:pPr>
-        <w:widowControl w:val="0"/>
-        <w:tabs>
-          <w:tab w:val="left" w:pos="3686"/>
-          <w:tab w:val="left" w:pos="4536"/>
-          <w:tab w:val="left" w:pos="4678"/>
-          <w:tab w:val="left" w:pos="6096"/>
-          <w:tab w:val="left" w:pos="6663"/>
-          <w:tab w:val="left" w:pos="7797"/>
-          <w:tab w:val="right" w:pos="9070"/>
-        </w:tabs>
-        <w:adjustRightInd w:val="0"/>
-        <w:spacing w:line="302" w:lineRule="auto"/>
-        <w:ind w:firstLine="709"/>
-        <w:jc w:val="both"/>
-        <w:textAlignment w:val="baseline"/>
-        <w:rPr>
-          <w:b/>
-          <w:sz w:val="24"/>
-          <w:szCs w:val="24"/>
-        </w:rPr>
-      </w:pPr>
-      <w:r>
-        <w:rPr>
-          <w:b/>
-          <w:sz w:val="24"/>
-          <w:szCs w:val="24"/>
-        </w:rPr>
-        <w:t>Kabul Tarihi</w:t>
-      </w:r>
-      <w:r>
-        <w:rPr>
-          <w:b/>
-          <w:sz w:val="24"/>
-          <w:szCs w:val="24"/>
-        </w:rPr>
-        <w:tab/>
-        <w:t>: 25/8/1971</w:t>
-      </w:r>
-    </w:p>
-    <w:p>
-      <w:pPr>
-        <w:widowControl w:val="0"/>
-        <w:tabs>
-          <w:tab w:val="left" w:pos="3686"/>
-          <w:tab w:val="left" w:pos="4536"/>
-          <w:tab w:val="left" w:pos="4678"/>
-          <w:tab w:val="left" w:pos="6096"/>
-          <w:tab w:val="left" w:pos="6663"/>
-          <w:tab w:val="left" w:pos="7797"/>
-          <w:tab w:val="right" w:pos="9070"/>
-        </w:tabs>
-        <w:adjustRightInd w:val="0"/>
-        <w:spacing w:line="302" w:lineRule="auto"/>
-        <w:ind w:firstLine="709"/>
-        <w:jc w:val="both"/>
-        <w:textAlignment w:val="baseline"/>
-        <w:rPr>
-          <w:b/>
-          <w:sz w:val="24"/>
-          <w:szCs w:val="24"/>
-        </w:rPr>
-      </w:pPr>
-      <w:r>
-        <w:rPr>
-          <w:b/>
-          <w:sz w:val="24"/>
-          <w:szCs w:val="24"/>
-        </w:rPr>
-        <w:t>Yayımlandığı Resmî Gazete</w:t>
-      </w:r>
-      <w:r>
-        <w:rPr>
-          <w:b/>
-          <w:sz w:val="24"/>
-          <w:szCs w:val="24"/>
-        </w:rPr>
-        <w:tab/>
-        <w:t>: Tarih</w:t>
-      </w:r>
-      <w:r>
-        <w:rPr>
-          <w:b/>
-          <w:sz w:val="24"/>
-          <w:szCs w:val="24"/>
-        </w:rPr>
-        <w:t>: 1/9/1971</w:t>
-      </w:r>
-      <w:r>
-        <w:rPr>
-          <w:b/>
-          <w:sz w:val="24"/>
-          <w:szCs w:val="24"/>
-        </w:rPr>
-        <w:tab/>
-        <w:t>Sayı</w:t>
-      </w:r>
-      <w:r>
-        <w:rPr>
-          <w:b/>
-          <w:sz w:val="24"/>
-          <w:szCs w:val="24"/>
-        </w:rPr>
-        <w:t>: 13943</w:t>
-      </w:r>
-    </w:p>
-    <w:p>
-      <w:pPr>
-        <w:widowControl w:val="0"/>
-        <w:tabs>
-          <w:tab w:val="left" w:pos="3686"/>
-          <w:tab w:val="left" w:pos="4536"/>
-          <w:tab w:val="left" w:pos="4678"/>
-          <w:tab w:val="left" w:pos="6096"/>
-          <w:tab w:val="left" w:pos="6663"/>
-          <w:tab w:val="left" w:pos="7797"/>
-          <w:tab w:val="right" w:pos="9070"/>
-        </w:tabs>
-        <w:adjustRightInd w:val="0"/>
-        <w:spacing w:line="302" w:lineRule="auto"/>
-        <w:ind w:firstLine="709"/>
-        <w:jc w:val="both"/>
-        <w:textAlignment w:val="baseline"/>
-        <w:rPr>
-          <w:b/>
-          <w:sz w:val="24"/>
-          <w:szCs w:val="24"/>
-        </w:rPr>
-      </w:pPr>
-      <w:r>
-        <w:rPr>
-          <w:b/>
-          <w:sz w:val="24"/>
-          <w:szCs w:val="24"/>
-        </w:rPr>
-        <w:t>Yayımlandığı Düstur</w:t>
-      </w:r>
-      <w:r>
-        <w:rPr>
-          <w:b/>
-          <w:sz w:val="24"/>
-          <w:szCs w:val="24"/>
-        </w:rPr>
-        <w:tab/>
-        <w:t>: Tertip</w:t>
-      </w:r>
-      <w:r>
-        <w:rPr>
-          <w:b/>
-          <w:sz w:val="24"/>
-          <w:szCs w:val="24"/>
-        </w:rPr>
-        <w:t>: 5</w:t>
-      </w:r>
-      <w:r>
-        <w:rPr>
-          <w:b/>
-          <w:sz w:val="24"/>
-          <w:szCs w:val="24"/>
-        </w:rPr>
-        <w:tab/>
-        <w:t>Cilt</w:t>
-      </w:r>
-      <w:r>
-        <w:rPr>
-          <w:b/>
-          <w:sz w:val="24"/>
-          <w:szCs w:val="24"/>
-        </w:rPr>
-        <w:t>: 10</w:t>
-      </w:r>
-      <w:r>
-        <w:rPr>
-          <w:b/>
-          <w:sz w:val="24"/>
-          <w:szCs w:val="24"/>
-        </w:rPr>
-        <w:tab/>
-        <w:t>Sayfa</w:t>
-      </w:r>
-      <w:r>
-        <w:rPr>
-          <w:b/>
-          <w:sz w:val="24"/>
-          <w:szCs w:val="24"/>
-        </w:rPr>
-        <w:t>: 3102</w:t>
-      </w:r>
-    </w:p>
-    <w:p>
-      <w:pPr>
-        <w:widowControl w:val="0"/>
-        <w:tabs>
-          <w:tab w:val="center" w:pos="3543"/>
-        </w:tabs>
-        <w:adjustRightInd w:val="0"/>
-        <w:spacing w:line="302" w:lineRule="auto"/>
-        <w:jc w:val="center"/>
-        <w:textAlignment w:val="baseline"/>
-        <w:rPr>
-          <w:sz w:val="24"/>
-          <w:szCs w:val="24"/>
-        </w:rPr>
-      </w:pPr>
-    </w:p>
-    <w:p>
-      <w:pPr>
-        <w:widowControl w:val="0"/>
-        <w:tabs>
-          <w:tab w:val="left" w:pos="567"/>
-        </w:tabs>
-        <w:adjustRightInd w:val="0"/>
-        <w:spacing w:line="302" w:lineRule="auto"/>
-        <w:jc w:val="both"/>
-        <w:textAlignment w:val="baseline"/>
-        <w:rPr>
-          <w:i/>
-          <w:sz w:val="24"/>
-          <w:szCs w:val="24"/>
-        </w:rPr>
-      </w:pPr>
-    </w:p>
-    <w:p>
-      <w:pPr>
-        <w:widowControl w:val="0"/>
-        <w:tabs>
-          <w:tab w:val="left" w:pos="567"/>
-        </w:tabs>
-        <w:adjustRightInd w:val="0"/>
-        <w:spacing w:line="302" w:lineRule="auto"/>
-        <w:jc w:val="both"/>
-        <w:textAlignment w:val="baseline"/>
-        <w:rPr>
-          <w:i/>
-          <w:sz w:val="24"/>
-          <w:szCs w:val="24"/>
-        </w:rPr>
-      </w:pPr>
-      <w:r>
-        <w:rPr>
-          <w:i/>
-          <w:sz w:val="24"/>
-          <w:szCs w:val="24"/>
-        </w:rPr>
-        <w:t xml:space="preserve">Not: 1475 sayılı </w:t>
-      </w:r>
-      <w:proofErr w:type="gramStart"/>
-      <w:r>
-        <w:rPr>
-          <w:i/>
-          <w:sz w:val="24"/>
-          <w:szCs w:val="24"/>
-        </w:rPr>
-        <w:t>İş Kanununun</w:t>
-      </w:r>
-      <w:proofErr w:type="gramEnd"/>
-      <w:r>
-        <w:rPr>
-          <w:i/>
-          <w:sz w:val="24"/>
-          <w:szCs w:val="24"/>
-        </w:rPr>
-        <w:t xml:space="preserve"> yalnızca </w:t>
-      </w:r>
-      <w:proofErr w:type="gramStart"/>
-      <w:r>
-        <w:rPr>
-          <w:i/>
-          <w:sz w:val="24"/>
-          <w:szCs w:val="24"/>
-        </w:rPr>
-        <w:t>14 üncü</w:t>
-      </w:r>
-      <w:proofErr w:type="gramEnd"/>
-      <w:r>
-        <w:rPr>
-          <w:i/>
-          <w:sz w:val="24"/>
-          <w:szCs w:val="24"/>
-        </w:rPr>
-        <w:t xml:space="preserve"> maddesi yürürlüktedir.</w:t>
-      </w:r>
-      <w:r>
-        <w:rPr>
-          <w:i/>
-          <w:sz w:val="24"/>
-          <w:szCs w:val="24"/>
-        </w:rPr>
-        <w:br/>
-        <w:t>Diğer maddeler 4857 sayılı İş Kanunu ile yürürlükten kaldırılmıştır.</w:t>
-      </w:r>
-    </w:p>
-    <w:p>
-      <w:pPr>
-        <w:widowControl w:val="0"/>
-        <w:tabs>
-          <w:tab w:val="left" w:pos="567"/>
-        </w:tabs>
-        <w:adjustRightInd w:val="0"/>
-        <w:spacing w:line="302" w:lineRule="auto"/>
-        <w:jc w:val="both"/>
-        <w:textAlignment w:val="baseline"/>
-        <w:rPr>
-          <w:i/>
-          <w:sz w:val="24"/>
-          <w:szCs w:val="24"/>
-        </w:rPr>
-      </w:pPr>
-    </w:p>
-    <w:p>
-      <w:pPr>
-        <w:widowControl w:val="0"/>
-        <w:tabs>
-          <w:tab w:val="left" w:pos="567"/>
-        </w:tabs>
-        <w:adjustRightInd w:val="0"/>
-        <w:spacing w:line="302" w:lineRule="auto"/>
-        <w:ind w:firstLine="709"/>
-        <w:jc w:val="both"/>
-        <w:textAlignment w:val="baseline"/>
-        <w:rPr>
-          <w:b/>
-          <w:sz w:val="24"/>
-          <w:szCs w:val="24"/>
-        </w:rPr>
-      </w:pPr>
-      <w:r>
-        <w:rPr>
-          <w:b/>
-          <w:sz w:val="24"/>
-          <w:szCs w:val="24"/>
-        </w:rPr>
-        <w:t>Kıdem tazminatı:</w:t>
-      </w:r>
-    </w:p>
-    <w:p>
-      <w:pPr>
-        <w:widowControl w:val="0"/>
-        <w:tabs>
-          <w:tab w:val="left" w:pos="567"/>
-        </w:tabs>
-        <w:adjustRightInd w:val="0"/>
-        <w:spacing w:line="302" w:lineRule="auto"/>
-        <w:ind w:firstLine="709"/>
         <w:jc w:val="both"/>
         <w:textAlignment w:val="baseline"/>
         <w:rPr>
@@ -657,7 +220,7 @@
           <w:sz w:val="24"/>
           <w:szCs w:val="24"/>
         </w:rPr>
-        <w:footnoteReference w:id="2"/>
+        <w:footnoteReference w:id="1"/>
       </w:r>
     </w:p>
     <w:p>
@@ -842,7 +405,119 @@
           <w:sz w:val="24"/>
           <w:szCs w:val="24"/>
         </w:rPr>
-        <w:t xml:space="preserve"> işyeri devrolmuş veya herhangi bir suretle el değiştirmişse devir mukavelesinde aksine bir hüküm yoksa işlemiş kıdem tazminatlarından </w:t>
+        <w:t xml:space="preserve"> işyeri devrolmuş veya herhangi bir suretle el değiştirmişse devir mukavelesinde aksine bir hüküm yoksa işlemiş kıdem tazminatlarından yeni işveren sorumludur</w:t>
+      </w:r>
+      <w:r>
+        <w:rPr>
+          <w:sz w:val="24"/>
+          <w:szCs w:val="24"/>
+        </w:rPr>
+        <w:t>.</w:t>
+      </w:r>
+    </w:p>
+    <w:p>
+      <w:pPr>
+        <w:widowControl w:val="0"/>
+        <w:tabs>
+          <w:tab w:val="left" w:pos="567"/>
+        </w:tabs>
+        <w:adjustRightInd w:val="0"/>
+        <w:spacing w:line="293" w:lineRule="auto"/>
+        <w:ind w:firstLine="709"/>
+        <w:jc w:val="both"/>
+        <w:textAlignment w:val="baseline"/>
+        <w:rPr>
+          <w:sz w:val="24"/>
+          <w:szCs w:val="24"/>
+        </w:rPr>
+      </w:pPr>
+    </w:p>
+    <w:p>
+      <w:pPr>
+        <w:widowControl w:val="0"/>
+        <w:tabs>
+          <w:tab w:val="left" w:pos="567"/>
+        </w:tabs>
+        <w:adjustRightInd w:val="0"/>
+        <w:spacing w:line="293" w:lineRule="auto"/>
+        <w:ind w:firstLine="709"/>
+        <w:jc w:val="both"/>
+        <w:textAlignment w:val="baseline"/>
+        <w:rPr>
+          <w:sz w:val="24"/>
+          <w:szCs w:val="24"/>
+        </w:rPr>
+      </w:pPr>
+      <w:r>
+        <w:rPr>
+          <w:sz w:val="24"/>
+          <w:szCs w:val="24"/>
+        </w:rPr>
+        <w:t xml:space="preserve">İşçinin birinci bendin </w:t>
+      </w:r>
+      <w:proofErr w:type="gramStart"/>
+      <w:r>
+        <w:rPr>
+          <w:sz w:val="24"/>
+          <w:szCs w:val="24"/>
+        </w:rPr>
+        <w:t>4 üncü</w:t>
+      </w:r>
+      <w:proofErr w:type="gramEnd"/>
+      <w:r>
+        <w:rPr>
+          <w:sz w:val="24"/>
+          <w:szCs w:val="24"/>
+        </w:rPr>
+        <w:t xml:space="preserve"> fıkrası hükmünden faydalanabilmesi için aylık veya toptan ödemeye hak kazanmış bulunduğunu ve kendisine aylık bağlanması veya toptan ödeme yapılması için yaşlılık sigortası bakımından bağlı bulunduğu kuruma veya sandığa müracaat etmiş olduğunu belgelemesi şarttır. İşçinin ölümü halinde bu şart aranmaz.</w:t>
+      </w:r>
+    </w:p>
+    <w:p>
+      <w:pPr>
+        <w:widowControl w:val="0"/>
+        <w:tabs>
+          <w:tab w:val="left" w:pos="567"/>
+        </w:tabs>
+        <w:adjustRightInd w:val="0"/>
+        <w:spacing w:line="293" w:lineRule="auto"/>
+        <w:ind w:firstLine="709"/>
+        <w:jc w:val="both"/>
+        <w:textAlignment w:val="baseline"/>
+        <w:rPr>
+          <w:sz w:val="24"/>
+          <w:szCs w:val="24"/>
+        </w:rPr>
+      </w:pPr>
+      <w:r>
+        <w:rPr>
+          <w:sz w:val="24"/>
+          <w:szCs w:val="24"/>
+        </w:rPr>
+        <w:t>T.C. Emekli Sandığı Kanunu ve Sosyal Sigortalar Kanununa veya yalnız Sosyal Sigortalar Kanununa tabi olarak sadece aynı ya da değişik kamu kuruluşlarında geçen hizmet sürelerinin birleştirilmesi suretiyle Sosyal Sigortalar Kanununa göre yaşlılık veya malullük aylığına ya da toptan ödemeye hak kazanan işçiye, bu kamu kuruluşlarında geçirdiği hizmet sürelerinin toplamı üzerinden son kamu kuruluşu işverenince kıdem tazminatı ödenir.</w:t>
+      </w:r>
+    </w:p>
+    <w:p>
+      <w:pPr>
+        <w:widowControl w:val="0"/>
+        <w:tabs>
+          <w:tab w:val="left" w:pos="567"/>
+        </w:tabs>
+        <w:adjustRightInd w:val="0"/>
+        <w:spacing w:line="293" w:lineRule="auto"/>
+        <w:ind w:firstLine="709"/>
+        <w:jc w:val="both"/>
+        <w:textAlignment w:val="baseline"/>
+        <w:rPr>
+          <w:sz w:val="24"/>
+          <w:szCs w:val="24"/>
+        </w:rPr>
+      </w:pPr>
+      <w:r>
+        <w:rPr>
+          <w:sz w:val="24"/>
+          <w:szCs w:val="24"/>
+        </w:rPr>
+        <w:t xml:space="preserve">Yukarıda belirtilen kamu kuruluşlarında işçinin hizmet akdinin evvelce bu maddeye göre kıdem tazminatı ödenmesini gerektirmeyecek şekilde sona ermesi suretiyle geçen hizmet </w:t>
       </w:r>
       <w:r>
         <w:rPr>
@@ -850,14 +525,7 @@
           <w:szCs w:val="24"/>
         </w:rPr>
         <w:lastRenderedPageBreak/>
-        <w:t>yeni işveren sorumludur</w:t>
-      </w:r>
-      <w:r>
-        <w:rPr>
-          <w:sz w:val="24"/>
-          <w:szCs w:val="24"/>
-        </w:rPr>
-        <w:t>.</w:t>
+        <w:t>süreleri kıdem tazminatının hesabında dikkate alınmaz.</w:t>
       </w:r>
     </w:p>
     <w:p>
@@ -872,10 +540,19 @@
         <w:jc w:val="both"/>
         <w:textAlignment w:val="baseline"/>
         <w:rPr>
-          <w:sz w:val="24"/>
-          <w:szCs w:val="24"/>
-        </w:rPr>
-      </w:pPr>
+          <w:spacing w:val="-2"/>
+          <w:sz w:val="24"/>
+          <w:szCs w:val="24"/>
+        </w:rPr>
+      </w:pPr>
+      <w:r>
+        <w:rPr>
+          <w:spacing w:val="-2"/>
+          <w:sz w:val="24"/>
+          <w:szCs w:val="24"/>
+        </w:rPr>
+        <w:t>Ancak, bu tazminatın T.C. Emekli Sandığına tabi olarak geçen hizmet süresine ait kısmı için ödenecek miktar, yaşlılık veya malullük aylığının başlangıç tarihinde T.C. Emekli Sandığı Kanununun yürürlükteki hükümlerine göre emeklilik ikramiyesi için öngörülen miktardan fazla olamaz.</w:t>
+      </w:r>
     </w:p>
     <w:p>
       <w:pPr>
@@ -898,7 +575,7 @@
           <w:sz w:val="24"/>
           <w:szCs w:val="24"/>
         </w:rPr>
-        <w:t xml:space="preserve">İşçinin birinci bendin </w:t>
+        <w:t xml:space="preserve">Bu maddede geçen kamu kuruluşları deyimi, genel, katma ve özel bütçeli idareler ile 468 sayılı Kanunun </w:t>
       </w:r>
       <w:proofErr w:type="gramStart"/>
       <w:r>
@@ -914,7 +591,7 @@
           <w:sz w:val="24"/>
           <w:szCs w:val="24"/>
         </w:rPr>
-        <w:t xml:space="preserve"> fıkrası hükmünden faydalanabilmesi için aylık veya toptan ödemeye hak kazanmış bulunduğunu ve kendisine aylık bağlanması veya toptan ödeme yapılması için yaşlılık sigortası bakımından bağlı bulunduğu kuruma veya sandığa müracaat etmiş olduğunu belgelemesi şarttır. İşçinin ölümü halinde bu şart aranmaz.</w:t>
+        <w:t xml:space="preserve"> maddesinde sayılan kurumları kapsar.</w:t>
       </w:r>
     </w:p>
     <w:p>
@@ -938,7 +615,7 @@
           <w:sz w:val="24"/>
           <w:szCs w:val="24"/>
         </w:rPr>
-        <w:t>T.C. Emekli Sandığı Kanunu ve Sosyal Sigortalar Kanununa veya yalnız Sosyal Sigortalar Kanununa tabi olarak sadece aynı ya da değişik kamu kuruluşlarında geçen hizmet sürelerinin birleştirilmesi suretiyle Sosyal Sigortalar Kanununa göre yaşlılık veya malullük aylığına ya da toptan ödemeye hak kazanan işçiye, bu kamu kuruluşlarında geçirdiği hizmet sürelerinin toplamı üzerinden son kamu kuruluşu işverenince kıdem tazminatı ödenir.</w:t>
+        <w:t>Aynı kıdem süresi için bir defadan fazla kıdem tazminatı veya ikramiye ödenmez.</w:t>
       </w:r>
     </w:p>
     <w:p>
@@ -953,16 +630,18 @@
         <w:jc w:val="both"/>
         <w:textAlignment w:val="baseline"/>
         <w:rPr>
-          <w:sz w:val="24"/>
-          <w:szCs w:val="24"/>
-        </w:rPr>
-      </w:pPr>
-      <w:r>
-        <w:rPr>
-          <w:sz w:val="24"/>
-          <w:szCs w:val="24"/>
-        </w:rPr>
-        <w:t>Yukarıda belirtilen kamu kuruluşlarında işçinin hizmet akdinin evvelce bu maddeye göre kıdem tazminatı ödenmesini gerektirmeyecek şekilde sona ermesi suretiyle geçen hizmet süreleri kıdem tazminatının hesabında dikkate alınmaz.</w:t>
+          <w:spacing w:val="-2"/>
+          <w:sz w:val="24"/>
+          <w:szCs w:val="24"/>
+        </w:rPr>
+      </w:pPr>
+      <w:r>
+        <w:rPr>
+          <w:spacing w:val="-2"/>
+          <w:sz w:val="24"/>
+          <w:szCs w:val="24"/>
+        </w:rPr>
+        <w:t>Kıdem tazminatının hesaplanması, son ücret üzerinden yapılır. Parça başı, akort, götürü veya yüzde usulü gibi ücretin sabit olmadığı hallerde son bir yıllık süre içinde ödenen ücretin o süre içinde çalışılan günlere bölünmesi suretiyle bulunacak ortalama ücret bu tazminatın hesabına esas tutulur.</w:t>
       </w:r>
     </w:p>
     <w:p>
@@ -977,50 +656,55 @@
         <w:jc w:val="both"/>
         <w:textAlignment w:val="baseline"/>
         <w:rPr>
-          <w:spacing w:val="-2"/>
-          <w:sz w:val="24"/>
-          <w:szCs w:val="24"/>
-        </w:rPr>
-      </w:pPr>
-      <w:r>
-        <w:rPr>
-          <w:spacing w:val="-2"/>
-          <w:sz w:val="24"/>
-          <w:szCs w:val="24"/>
-        </w:rPr>
-        <w:t>Ancak, bu tazminatın T.C. Emekli Sandığına tabi olarak geçen hizmet süresine ait kısmı için ödenecek miktar, yaşlılık veya malullük aylığının başlangıç tarihinde T.C. Emekli Sandığı Kanununun yürürlükteki hükümlerine göre emeklilik ikramiyesi için öngörülen miktardan fazla olamaz.</w:t>
-      </w:r>
-    </w:p>
-    <w:p>
-      <w:pPr>
-        <w:widowControl w:val="0"/>
-        <w:tabs>
-          <w:tab w:val="left" w:pos="567"/>
-        </w:tabs>
-        <w:adjustRightInd w:val="0"/>
-        <w:spacing w:line="293" w:lineRule="auto"/>
-        <w:ind w:firstLine="709"/>
-        <w:jc w:val="both"/>
-        <w:textAlignment w:val="baseline"/>
-        <w:rPr>
-          <w:sz w:val="24"/>
-          <w:szCs w:val="24"/>
-        </w:rPr>
-      </w:pPr>
-      <w:r>
-        <w:rPr>
-          <w:sz w:val="24"/>
-          <w:szCs w:val="24"/>
-        </w:rPr>
-        <w:t xml:space="preserve">Bu maddede geçen kamu kuruluşları deyimi, genel, katma ve özel bütçeli idareler ile 468 sayılı Kanunun </w:t>
-      </w:r>
+          <w:sz w:val="24"/>
+          <w:szCs w:val="24"/>
+        </w:rPr>
+      </w:pPr>
+      <w:r>
+        <w:rPr>
+          <w:sz w:val="24"/>
+          <w:szCs w:val="24"/>
+        </w:rPr>
+        <w:t>Ancak, son bir yıl içinde işçi ücretine zam yapıldığı takdirde, tazminata esas ücret,</w:t>
+      </w:r>
+      <w:r>
+        <w:rPr>
+          <w:sz w:val="24"/>
+          <w:szCs w:val="24"/>
+        </w:rPr>
+        <w:t xml:space="preserve"> </w:t>
+      </w:r>
+      <w:r>
+        <w:rPr>
+          <w:sz w:val="24"/>
+          <w:szCs w:val="24"/>
+        </w:rPr>
+        <w:t>işçinin işten ayrılma tarihi ile zammın yapıldığı tarih arasında alınan ücretin aynı süre içinde çalışılan günlere bölünmesi suretiyle hesaplanır.</w:t>
+      </w:r>
+    </w:p>
+    <w:p>
+      <w:pPr>
+        <w:widowControl w:val="0"/>
+        <w:tabs>
+          <w:tab w:val="left" w:pos="567"/>
+        </w:tabs>
+        <w:adjustRightInd w:val="0"/>
+        <w:spacing w:line="307" w:lineRule="auto"/>
+        <w:ind w:firstLine="709"/>
+        <w:jc w:val="both"/>
+        <w:textAlignment w:val="baseline"/>
+        <w:rPr>
+          <w:sz w:val="24"/>
+          <w:szCs w:val="24"/>
+        </w:rPr>
+      </w:pPr>
       <w:proofErr w:type="gramStart"/>
       <w:r>
         <w:rPr>
           <w:sz w:val="24"/>
           <w:szCs w:val="24"/>
         </w:rPr>
-        <w:t>4 üncü</w:t>
+        <w:t>13 üncü</w:t>
       </w:r>
       <w:proofErr w:type="gramEnd"/>
       <w:r>
@@ -1028,81 +712,7 @@
           <w:sz w:val="24"/>
           <w:szCs w:val="24"/>
         </w:rPr>
-        <w:t xml:space="preserve"> maddesinde sayılan kurumları kapsar.</w:t>
-      </w:r>
-    </w:p>
-    <w:p>
-      <w:pPr>
-        <w:widowControl w:val="0"/>
-        <w:tabs>
-          <w:tab w:val="left" w:pos="567"/>
-        </w:tabs>
-        <w:adjustRightInd w:val="0"/>
-        <w:spacing w:line="293" w:lineRule="auto"/>
-        <w:ind w:firstLine="709"/>
-        <w:jc w:val="both"/>
-        <w:textAlignment w:val="baseline"/>
-        <w:rPr>
-          <w:sz w:val="24"/>
-          <w:szCs w:val="24"/>
-        </w:rPr>
-      </w:pPr>
-      <w:r>
-        <w:rPr>
-          <w:sz w:val="24"/>
-          <w:szCs w:val="24"/>
-        </w:rPr>
-        <w:t>Aynı kıdem süresi için bir defadan fazla kıdem tazminatı veya ikramiye ödenmez.</w:t>
-      </w:r>
-    </w:p>
-    <w:p>
-      <w:pPr>
-        <w:widowControl w:val="0"/>
-        <w:tabs>
-          <w:tab w:val="left" w:pos="567"/>
-        </w:tabs>
-        <w:adjustRightInd w:val="0"/>
-        <w:spacing w:line="293" w:lineRule="auto"/>
-        <w:ind w:firstLine="709"/>
-        <w:jc w:val="both"/>
-        <w:textAlignment w:val="baseline"/>
-        <w:rPr>
-          <w:spacing w:val="-2"/>
-          <w:sz w:val="24"/>
-          <w:szCs w:val="24"/>
-        </w:rPr>
-      </w:pPr>
-      <w:r>
-        <w:rPr>
-          <w:spacing w:val="-2"/>
-          <w:sz w:val="24"/>
-          <w:szCs w:val="24"/>
-        </w:rPr>
-        <w:t>Kıdem tazminatının hesaplanması, son ücret üzerinden yapılır. Parça başı, akort, götürü veya yüzde usulü gibi ücretin sabit olmadığı hallerde son bir yıllık süre içinde ödenen ücretin o süre içinde çalışılan günlere bölünmesi suretiyle bulunacak ortalama ücret bu tazminatın hesabına esas tutulur.</w:t>
-      </w:r>
-    </w:p>
-    <w:p>
-      <w:pPr>
-        <w:widowControl w:val="0"/>
-        <w:tabs>
-          <w:tab w:val="left" w:pos="567"/>
-        </w:tabs>
-        <w:adjustRightInd w:val="0"/>
-        <w:spacing w:line="293" w:lineRule="auto"/>
-        <w:ind w:firstLine="709"/>
-        <w:jc w:val="both"/>
-        <w:textAlignment w:val="baseline"/>
-        <w:rPr>
-          <w:sz w:val="24"/>
-          <w:szCs w:val="24"/>
-        </w:rPr>
-      </w:pPr>
-      <w:r>
-        <w:rPr>
-          <w:sz w:val="24"/>
-          <w:szCs w:val="24"/>
-        </w:rPr>
-        <w:t>Ancak, son bir yıl içinde işçi ücretine zam yapıldığı takdirde, tazminata esas ücret,</w:t>
+        <w:t xml:space="preserve"> maddesinde sözü geçen</w:t>
       </w:r>
       <w:r>
         <w:rPr>
@@ -1116,7 +726,181 @@
           <w:sz w:val="24"/>
           <w:szCs w:val="24"/>
         </w:rPr>
-        <w:t>işçinin işten ayrılma tarihi ile zammın yapıldığı tarih arasında alınan ücretin aynı süre içinde çalışılan günlere bölünmesi suretiyle hesaplanır.</w:t>
+        <w:t xml:space="preserve">tazminat ile bu maddede yer alan kıdem tazminatına esas olacak ücretin hesabında 26 </w:t>
+      </w:r>
+      <w:proofErr w:type="spellStart"/>
+      <w:r>
+        <w:rPr>
+          <w:sz w:val="24"/>
+          <w:szCs w:val="24"/>
+        </w:rPr>
+        <w:t>ncı</w:t>
+      </w:r>
+      <w:proofErr w:type="spellEnd"/>
+      <w:r>
+        <w:rPr>
+          <w:sz w:val="24"/>
+          <w:szCs w:val="24"/>
+        </w:rPr>
+        <w:t xml:space="preserve"> maddenin birinci fıkrasında yazılı ücrete ilaveten işçiye sağlanmış olan para ve para ile ölçülmesi mümkün akdi ve kanundan doğan</w:t>
+      </w:r>
+      <w:r>
+        <w:rPr>
+          <w:sz w:val="24"/>
+          <w:szCs w:val="24"/>
+        </w:rPr>
+        <w:t xml:space="preserve"> </w:t>
+      </w:r>
+      <w:r>
+        <w:rPr>
+          <w:sz w:val="24"/>
+          <w:szCs w:val="24"/>
+        </w:rPr>
+        <w:t>menfaatler de</w:t>
+      </w:r>
+      <w:r>
+        <w:rPr>
+          <w:sz w:val="24"/>
+          <w:szCs w:val="24"/>
+        </w:rPr>
+        <w:t xml:space="preserve"> </w:t>
+      </w:r>
+      <w:proofErr w:type="spellStart"/>
+      <w:r>
+        <w:rPr>
+          <w:sz w:val="24"/>
+          <w:szCs w:val="24"/>
+        </w:rPr>
+        <w:t>gözönünde</w:t>
+      </w:r>
+      <w:proofErr w:type="spellEnd"/>
+      <w:r>
+        <w:rPr>
+          <w:sz w:val="24"/>
+          <w:szCs w:val="24"/>
+        </w:rPr>
+        <w:t xml:space="preserve"> </w:t>
+      </w:r>
+      <w:r>
+        <w:rPr>
+          <w:sz w:val="24"/>
+          <w:szCs w:val="24"/>
+        </w:rPr>
+        <w:t>tutulur.</w:t>
+      </w:r>
+      <w:r>
+        <w:rPr>
+          <w:sz w:val="24"/>
+          <w:szCs w:val="24"/>
+        </w:rPr>
+        <w:t xml:space="preserve"> </w:t>
+      </w:r>
+      <w:r>
+        <w:rPr>
+          <w:sz w:val="24"/>
+          <w:szCs w:val="24"/>
+        </w:rPr>
+        <w:t>Kıdem</w:t>
+      </w:r>
+      <w:r>
+        <w:rPr>
+          <w:sz w:val="24"/>
+          <w:szCs w:val="24"/>
+        </w:rPr>
+        <w:t xml:space="preserve"> </w:t>
+      </w:r>
+      <w:r>
+        <w:rPr>
+          <w:sz w:val="24"/>
+          <w:szCs w:val="24"/>
+        </w:rPr>
+        <w:t>tazminatının</w:t>
+      </w:r>
+      <w:r>
+        <w:rPr>
+          <w:sz w:val="24"/>
+          <w:szCs w:val="24"/>
+        </w:rPr>
+        <w:t xml:space="preserve"> </w:t>
+      </w:r>
+      <w:r>
+        <w:rPr>
+          <w:sz w:val="24"/>
+          <w:szCs w:val="24"/>
+        </w:rPr>
+        <w:t>zamanında</w:t>
+      </w:r>
+      <w:r>
+        <w:rPr>
+          <w:sz w:val="24"/>
+          <w:szCs w:val="24"/>
+        </w:rPr>
+        <w:t xml:space="preserve"> </w:t>
+      </w:r>
+      <w:r>
+        <w:rPr>
+          <w:sz w:val="24"/>
+          <w:szCs w:val="24"/>
+        </w:rPr>
+        <w:t>ödenmemesi</w:t>
+      </w:r>
+      <w:r>
+        <w:rPr>
+          <w:sz w:val="24"/>
+          <w:szCs w:val="24"/>
+        </w:rPr>
+        <w:t xml:space="preserve"> </w:t>
+      </w:r>
+      <w:r>
+        <w:rPr>
+          <w:sz w:val="24"/>
+          <w:szCs w:val="24"/>
+        </w:rPr>
+        <w:t>sebebiyle</w:t>
+      </w:r>
+      <w:r>
+        <w:rPr>
+          <w:sz w:val="24"/>
+          <w:szCs w:val="24"/>
+        </w:rPr>
+        <w:t xml:space="preserve"> </w:t>
+      </w:r>
+      <w:r>
+        <w:rPr>
+          <w:sz w:val="24"/>
+          <w:szCs w:val="24"/>
+        </w:rPr>
+        <w:t>açılacak</w:t>
+      </w:r>
+      <w:r>
+        <w:rPr>
+          <w:sz w:val="24"/>
+          <w:szCs w:val="24"/>
+        </w:rPr>
+        <w:t xml:space="preserve"> </w:t>
+      </w:r>
+      <w:r>
+        <w:rPr>
+          <w:sz w:val="24"/>
+          <w:szCs w:val="24"/>
+        </w:rPr>
+        <w:t xml:space="preserve">davanın sonunda </w:t>
+      </w:r>
+      <w:proofErr w:type="gramStart"/>
+      <w:r>
+        <w:rPr>
+          <w:sz w:val="24"/>
+          <w:szCs w:val="24"/>
+        </w:rPr>
+        <w:t>hakim</w:t>
+      </w:r>
+      <w:proofErr w:type="gramEnd"/>
+      <w:r>
+        <w:rPr>
+          <w:sz w:val="24"/>
+          <w:szCs w:val="24"/>
+        </w:rPr>
+        <w:t xml:space="preserve"> gecikme süresi için, ödenmeyen süreye göre mevduata uygulanan en yüksek faizin ödenmesine hükmeder. İşçinin mevzuattan doğan diğer hakları saklıdır.</w:t>
       </w:r>
     </w:p>
     <w:p>
@@ -1135,13 +919,60 @@
           <w:szCs w:val="24"/>
         </w:rPr>
       </w:pPr>
+      <w:r>
+        <w:rPr>
+          <w:sz w:val="24"/>
+          <w:szCs w:val="24"/>
+        </w:rPr>
+        <w:t xml:space="preserve">Bu maddede belirtilen kıdem tazminatı ile ilgili 30 günlük süre hizmet </w:t>
+      </w:r>
+      <w:proofErr w:type="spellStart"/>
+      <w:r>
+        <w:rPr>
+          <w:sz w:val="24"/>
+          <w:szCs w:val="24"/>
+        </w:rPr>
+        <w:t>akidleri</w:t>
+      </w:r>
+      <w:proofErr w:type="spellEnd"/>
+      <w:r>
+        <w:rPr>
+          <w:sz w:val="24"/>
+          <w:szCs w:val="24"/>
+        </w:rPr>
+        <w:t xml:space="preserve"> veya toplu iş sözleşmeleri ile işçi lehine değiştirilebilir.</w:t>
+      </w:r>
+    </w:p>
+    <w:p>
+      <w:pPr>
+        <w:widowControl w:val="0"/>
+        <w:tabs>
+          <w:tab w:val="left" w:pos="567"/>
+        </w:tabs>
+        <w:adjustRightInd w:val="0"/>
+        <w:spacing w:line="307" w:lineRule="auto"/>
+        <w:ind w:firstLine="709"/>
+        <w:jc w:val="both"/>
+        <w:textAlignment w:val="baseline"/>
+        <w:rPr>
+          <w:sz w:val="24"/>
+          <w:szCs w:val="24"/>
+        </w:rPr>
+      </w:pPr>
+      <w:r>
+        <w:rPr>
+          <w:sz w:val="24"/>
+          <w:szCs w:val="24"/>
+        </w:rPr>
+        <w:t xml:space="preserve">Ancak, toplu sözleşmelerle ve hizmet akitleriyle belirlenen kıdem tazminatlarının yıllık miktarı, </w:t>
+      </w:r>
       <w:proofErr w:type="gramStart"/>
       <w:r>
         <w:rPr>
           <w:sz w:val="24"/>
           <w:szCs w:val="24"/>
         </w:rPr>
-        <w:t>13 üncü</w:t>
+        <w:t>Devlet Memurları Kanununa</w:t>
       </w:r>
       <w:proofErr w:type="gramEnd"/>
       <w:r>
@@ -1149,204 +980,7 @@
           <w:sz w:val="24"/>
           <w:szCs w:val="24"/>
         </w:rPr>
-        <w:t xml:space="preserve"> maddesinde sözü geçen</w:t>
-      </w:r>
-      <w:r>
-        <w:rPr>
-          <w:sz w:val="24"/>
-          <w:szCs w:val="24"/>
-        </w:rPr>
-        <w:t xml:space="preserve"> </w:t>
-      </w:r>
-      <w:r>
-        <w:rPr>
-          <w:sz w:val="24"/>
-          <w:szCs w:val="24"/>
-        </w:rPr>
-        <w:t xml:space="preserve">tazminat ile bu maddede yer alan kıdem tazminatına esas olacak ücretin hesabında </w:t>
-      </w:r>
-      <w:proofErr w:type="gramStart"/>
-      <w:r>
-        <w:rPr>
-          <w:sz w:val="24"/>
-          <w:szCs w:val="24"/>
-        </w:rPr>
-        <w:t xml:space="preserve">26 </w:t>
-      </w:r>
-      <w:proofErr w:type="spellStart"/>
-      <w:r>
-        <w:rPr>
-          <w:sz w:val="24"/>
-          <w:szCs w:val="24"/>
-        </w:rPr>
-        <w:t>ncı</w:t>
-      </w:r>
-      <w:proofErr w:type="spellEnd"/>
-      <w:proofErr w:type="gramEnd"/>
-      <w:r>
-        <w:rPr>
-          <w:sz w:val="24"/>
-          <w:szCs w:val="24"/>
-        </w:rPr>
-        <w:t xml:space="preserve"> maddenin birinci fıkrasında yazılı ücrete ilaveten işçiye sağlanmış olan para ve para ile ölçülmesi mümkün akdi ve kanundan doğan</w:t>
-      </w:r>
-      <w:r>
-        <w:rPr>
-          <w:sz w:val="24"/>
-          <w:szCs w:val="24"/>
-        </w:rPr>
-        <w:t xml:space="preserve"> </w:t>
-      </w:r>
-      <w:r>
-        <w:rPr>
-          <w:sz w:val="24"/>
-          <w:szCs w:val="24"/>
-        </w:rPr>
-        <w:t>menfaatler de</w:t>
-      </w:r>
-      <w:r>
-        <w:rPr>
-          <w:sz w:val="24"/>
-          <w:szCs w:val="24"/>
-        </w:rPr>
-        <w:t xml:space="preserve"> </w:t>
-      </w:r>
-      <w:proofErr w:type="spellStart"/>
-      <w:r>
-        <w:rPr>
-          <w:sz w:val="24"/>
-          <w:szCs w:val="24"/>
-        </w:rPr>
-        <w:t>gözönünde</w:t>
-      </w:r>
-      <w:proofErr w:type="spellEnd"/>
-      <w:r>
-        <w:rPr>
-          <w:sz w:val="24"/>
-          <w:szCs w:val="24"/>
-        </w:rPr>
-        <w:t xml:space="preserve"> </w:t>
-      </w:r>
-      <w:r>
-        <w:rPr>
-          <w:sz w:val="24"/>
-          <w:szCs w:val="24"/>
-        </w:rPr>
-        <w:t>tutulur.</w:t>
-      </w:r>
-      <w:r>
-        <w:rPr>
-          <w:sz w:val="24"/>
-          <w:szCs w:val="24"/>
-        </w:rPr>
-        <w:t xml:space="preserve"> </w:t>
-      </w:r>
-      <w:r>
-        <w:rPr>
-          <w:sz w:val="24"/>
-          <w:szCs w:val="24"/>
-        </w:rPr>
-        <w:t>Kıdem</w:t>
-      </w:r>
-      <w:r>
-        <w:rPr>
-          <w:sz w:val="24"/>
-          <w:szCs w:val="24"/>
-        </w:rPr>
-        <w:t xml:space="preserve"> </w:t>
-      </w:r>
-      <w:r>
-        <w:rPr>
-          <w:sz w:val="24"/>
-          <w:szCs w:val="24"/>
-        </w:rPr>
-        <w:t>tazminatının</w:t>
-      </w:r>
-      <w:r>
-        <w:rPr>
-          <w:sz w:val="24"/>
-          <w:szCs w:val="24"/>
-        </w:rPr>
-        <w:t xml:space="preserve"> </w:t>
-      </w:r>
-      <w:r>
-        <w:rPr>
-          <w:sz w:val="24"/>
-          <w:szCs w:val="24"/>
-        </w:rPr>
-        <w:t>zamanında</w:t>
-      </w:r>
-      <w:r>
-        <w:rPr>
-          <w:sz w:val="24"/>
-          <w:szCs w:val="24"/>
-        </w:rPr>
-        <w:t xml:space="preserve"> </w:t>
-      </w:r>
-      <w:r>
-        <w:rPr>
-          <w:sz w:val="24"/>
-          <w:szCs w:val="24"/>
-        </w:rPr>
-        <w:t>ödenmemesi</w:t>
-      </w:r>
-      <w:r>
-        <w:rPr>
-          <w:sz w:val="24"/>
-          <w:szCs w:val="24"/>
-        </w:rPr>
-        <w:t xml:space="preserve"> </w:t>
-      </w:r>
-      <w:r>
-        <w:rPr>
-          <w:sz w:val="24"/>
-          <w:szCs w:val="24"/>
-        </w:rPr>
-        <w:t>sebebiyle</w:t>
-      </w:r>
-      <w:r>
-        <w:rPr>
-          <w:sz w:val="24"/>
-          <w:szCs w:val="24"/>
-        </w:rPr>
-        <w:t xml:space="preserve"> </w:t>
-      </w:r>
-      <w:r>
-        <w:rPr>
-          <w:sz w:val="24"/>
-          <w:szCs w:val="24"/>
-        </w:rPr>
-        <w:t>açılacak</w:t>
-      </w:r>
-      <w:r>
-        <w:rPr>
-          <w:sz w:val="24"/>
-          <w:szCs w:val="24"/>
-        </w:rPr>
-        <w:t xml:space="preserve"> </w:t>
-      </w:r>
-      <w:r>
-        <w:rPr>
-          <w:sz w:val="24"/>
-          <w:szCs w:val="24"/>
-        </w:rPr>
-        <w:t xml:space="preserve">davanın sonunda </w:t>
-      </w:r>
-      <w:proofErr w:type="gramStart"/>
-      <w:r>
-        <w:rPr>
-          <w:sz w:val="24"/>
-          <w:szCs w:val="24"/>
-        </w:rPr>
-        <w:t>hakim</w:t>
-      </w:r>
-      <w:proofErr w:type="gramEnd"/>
-      <w:r>
-        <w:rPr>
-          <w:sz w:val="24"/>
-          <w:szCs w:val="24"/>
-        </w:rPr>
-        <w:t xml:space="preserve"> gecikme süresi için, ödenmeyen süreye göre mevduata uygulanan en yüksek faizin ödenmesine hükmeder. İşçinin mevzuattan doğan diğer hakları saklıdır.</w:t>
+        <w:t xml:space="preserve"> tabi en yüksek Devlet memuruna 5434 sayılı T.C. Emekli Sandığı Kanunu hükümlerine göre bir hizmet yılı için ödenecek azami emeklilik ikramiyesini geçemez.</w:t>
       </w:r>
     </w:p>
     <w:p>
@@ -1370,95 +1004,7 @@
           <w:sz w:val="24"/>
           <w:szCs w:val="24"/>
         </w:rPr>
-        <w:t xml:space="preserve">Bu maddede belirtilen kıdem tazminatı ile ilgili 30 günlük süre hizmet </w:t>
-      </w:r>
-      <w:proofErr w:type="spellStart"/>
-      <w:r>
-        <w:rPr>
-          <w:sz w:val="24"/>
-          <w:szCs w:val="24"/>
-        </w:rPr>
-        <w:t>akidleri</w:t>
-      </w:r>
-      <w:proofErr w:type="spellEnd"/>
-      <w:r>
-        <w:rPr>
-          <w:sz w:val="24"/>
-          <w:szCs w:val="24"/>
-        </w:rPr>
-        <w:t xml:space="preserve"> veya toplu iş sözleşmeleri ile işçi lehine değiştirilebilir.</w:t>
-      </w:r>
-    </w:p>
-    <w:p>
-      <w:pPr>
-        <w:widowControl w:val="0"/>
-        <w:tabs>
-          <w:tab w:val="left" w:pos="567"/>
-        </w:tabs>
-        <w:adjustRightInd w:val="0"/>
-        <w:spacing w:line="307" w:lineRule="auto"/>
-        <w:ind w:firstLine="709"/>
-        <w:jc w:val="both"/>
-        <w:textAlignment w:val="baseline"/>
-        <w:rPr>
-          <w:sz w:val="24"/>
-          <w:szCs w:val="24"/>
-        </w:rPr>
-      </w:pPr>
-      <w:r>
-        <w:rPr>
-          <w:sz w:val="24"/>
-          <w:szCs w:val="24"/>
-        </w:rPr>
-        <w:t xml:space="preserve">Ancak, toplu sözleşmelerle ve hizmet akitleriyle belirlenen kıdem tazminatlarının yıllık miktarı, </w:t>
-      </w:r>
-      <w:proofErr w:type="gramStart"/>
-      <w:r>
-        <w:rPr>
-          <w:sz w:val="24"/>
-          <w:szCs w:val="24"/>
-        </w:rPr>
-        <w:t>Devlet Memurları Kanununa</w:t>
-      </w:r>
-      <w:proofErr w:type="gramEnd"/>
-      <w:r>
-        <w:rPr>
-          <w:sz w:val="24"/>
-          <w:szCs w:val="24"/>
-        </w:rPr>
-        <w:t xml:space="preserve"> tabi en yüksek Devlet memuruna 5434 sayılı T.C. Emekli Sandığı Kanunu hükümlerine göre bir hizmet yılı için ödenecek azami emeklilik ikramiyesini geçemez.</w:t>
-      </w:r>
-    </w:p>
-    <w:p>
-      <w:pPr>
-        <w:widowControl w:val="0"/>
-        <w:tabs>
-          <w:tab w:val="left" w:pos="567"/>
-        </w:tabs>
-        <w:adjustRightInd w:val="0"/>
-        <w:spacing w:line="307" w:lineRule="auto"/>
-        <w:ind w:firstLine="709"/>
-        <w:jc w:val="both"/>
-        <w:textAlignment w:val="baseline"/>
-        <w:rPr>
-          <w:sz w:val="24"/>
-          <w:szCs w:val="24"/>
-        </w:rPr>
-      </w:pPr>
-      <w:r>
-        <w:rPr>
-          <w:sz w:val="24"/>
-          <w:szCs w:val="24"/>
-        </w:rPr>
-        <w:t xml:space="preserve">İşçinin ölümü halinde yukarıdaki hükümlere göre doğan tazminat tutarı, kanuni </w:t>
-      </w:r>
-      <w:r>
-        <w:rPr>
-          <w:sz w:val="24"/>
-          <w:szCs w:val="24"/>
-        </w:rPr>
-        <w:lastRenderedPageBreak/>
-        <w:t>mirasçılarına ödenir.</w:t>
+        <w:t>İşçinin ölümü halinde yukarıdaki hükümlere göre doğan tazminat tutarı, kanuni mirasçılarına ödenir.</w:t>
       </w:r>
     </w:p>
     <w:p>
@@ -1596,7 +1142,7 @@
 </file>
 
 <file path=word/endnotes.xml><?xml version="1.0" encoding="utf-8"?>
-<w:endnotes xmlns:wpc="http://schemas.microsoft.com/office/word/2010/wordprocessingCanvas" xmlns:cx="http://schemas.microsoft.com/office/drawing/2014/chartex" xmlns:cx1="http://schemas.microsoft.com/office/drawing/2015/9/8/chartex" xmlns:cx2="http://schemas.microsoft.com/office/drawing/2015/10/21/chartex" xmlns:cx3="http://schemas.microsoft.com/office/drawing/2016/5/9/chartex" xmlns:cx4="http://schemas.microsoft.com/office/drawing/2016/5/10/chartex" xmlns:cx5="http://schemas.microsoft.com/office/drawing/2016/5/11/chartex" xmlns:cx6="http://schemas.microsoft.com/office/drawing/2016/5/12/chartex" xmlns:cx7="http://schemas.microsoft.com/office/drawing/2016/5/13/chartex" xmlns:cx8="http://schemas.microsoft.com/office/drawing/2016/5/14/chartex" xmlns:mc="http://schemas.openxmlformats.org/markup-compatibility/2006" xmlns:aink="http://schemas.microsoft.com/office/drawing/2016/ink" xmlns:am3d="http://schemas.microsoft.com/office/drawing/2017/model3d" xmlns:o="urn:schemas-microsoft-com:office:office" xmlns:oel="http://schemas.microsoft.com/office/2019/extlst" xmlns:r="http://schemas.openxmlformats.org/officeDocument/2006/relationships" xmlns:m="http://schemas.openxmlformats.org/officeDocument/2006/math" xmlns:v="urn:schemas-microsoft-com:vml" xmlns:wp14="http://schemas.microsoft.com/office/word/2010/wordprocessingDrawing" xmlns:wp="http://schemas.openxmlformats.org/drawingml/2006/wordprocessingDrawing" xmlns:w10="urn:schemas-microsoft-com:office:word" xmlns:w="http://schemas.openxmlformats.org/wordprocessingml/2006/main" xmlns:w14="http://schemas.microsoft.com/office/word/2010/wordml" xmlns:w15="http://schemas.microsoft.com/office/word/2012/wordml" xmlns:w16cex="http://schemas.microsoft.com/office/word/2018/wordml/cex" xmlns:w16cid="http://schemas.microsoft.com/office/word/2016/wordml/cid" xmlns:w16="http://schemas.microsoft.com/office/word/2018/wordml" xmlns:w16du="http://schemas.microsoft.com/office/word/2023/wordml/word16du" xmlns:w16sdtdh="http://schemas.microsoft.com/office/word/2020/wordml/sdtdatahash" xmlns:w16sdtfl="http://schemas.microsoft.com/office/word/2024/wordml/sdtformatlock" xmlns:w16se="http://schemas.microsoft.com/office/word/2015/wordml/symex" xmlns:wpg="http://schemas.microsoft.com/office/word/2010/wordprocessingGroup" xmlns:wpi="http://schemas.microsoft.com/office/word/2010/wordprocessingInk" xmlns:wne="http://schemas.microsoft.com/office/word/2006/wordml" xmlns:wps="http://schemas.microsoft.com/office/word/2010/wordprocessingShape" mc:Ignorable="w14 w15 w16se w16cid w16 w16cex w16sdtdh w16sdtfl w16du wp14">
+<w:endnotes xmlns:wpc="http://schemas.microsoft.com/office/word/2010/wordprocessingCanvas" xmlns:cx="http://schemas.microsoft.com/office/drawing/2014/chartex" xmlns:cx1="http://schemas.microsoft.com/office/drawing/2015/9/8/chartex" xmlns:cx2="http://schemas.microsoft.com/office/drawing/2015/10/21/chartex" xmlns:cx3="http://schemas.microsoft.com/office/drawing/2016/5/9/chartex" xmlns:cx4="http://schemas.microsoft.com/office/drawing/2016/5/10/chartex" xmlns:cx5="http://schemas.microsoft.com/office/drawing/2016/5/11/chartex" xmlns:cx6="http://schemas.microsoft.com/office/drawing/2016/5/12/chartex" xmlns:cx7="http://schemas.microsoft.com/office/drawing/2016/5/13/chartex" xmlns:cx8="http://schemas.microsoft.com/office/drawing/2016/5/14/chartex" xmlns:mc="http://schemas.openxmlformats.org/markup-compatibility/2006" xmlns:aink="http://schemas.microsoft.com/office/drawing/2016/ink" xmlns:am3d="http://schemas.microsoft.com/office/drawing/2017/model3d" xmlns:o="urn:schemas-microsoft-com:office:office" xmlns:oel="http://schemas.microsoft.com/office/2019/extlst" xmlns:r="http://schemas.openxmlformats.org/officeDocument/2006/relationships" xmlns:m="http://schemas.openxmlformats.org/officeDocument/2006/math" xmlns:v="urn:schemas-microsoft-com:vml" xmlns:wp14="http://schemas.microsoft.com/office/word/2010/wordprocessingDrawing" xmlns:wp="http://schemas.openxmlformats.org/drawingml/2006/wordprocessingDrawing" xmlns:w10="urn:schemas-microsoft-com:office:word" xmlns:w="http://schemas.openxmlformats.org/wordprocessingml/2006/main" xmlns:w14="http://schemas.microsoft.com/office/word/2010/wordml" xmlns:w15="http://schemas.microsoft.com/office/word/2012/wordml" xmlns:w16cex="http://schemas.microsoft.com/office/word/2018/wordml/cex" xmlns:w16cid="http://schemas.microsoft.com/office/word/2016/wordml/cid" xmlns:w16="http://schemas.microsoft.com/office/word/2018/wordml" xmlns:w16sdtdh="http://schemas.microsoft.com/office/word/2020/wordml/sdtdatahash" xmlns:w16se="http://schemas.microsoft.com/office/word/2015/wordml/symex" xmlns:wpg="http://schemas.microsoft.com/office/word/2010/wordprocessingGroup" xmlns:wpi="http://schemas.microsoft.com/office/word/2010/wordprocessingInk" xmlns:wne="http://schemas.microsoft.com/office/word/2006/wordml" xmlns:wps="http://schemas.microsoft.com/office/word/2010/wordprocessingShape" mc:Ignorable="w14 w15 w16se w16cid w16 w16cex w16sdtdh wp14">
   <w:endnote w:type="separator" w:id="-1">
     <w:p>
       <w:r>
@@ -1615,7 +1161,7 @@
 </file>
 
 <file path=word/footnotes.xml><?xml version="1.0" encoding="utf-8"?>
-<w:footnotes xmlns:wpc="http://schemas.microsoft.com/office/word/2010/wordprocessingCanvas" xmlns:cx="http://schemas.microsoft.com/office/drawing/2014/chartex" xmlns:cx1="http://schemas.microsoft.com/office/drawing/2015/9/8/chartex" xmlns:cx2="http://schemas.microsoft.com/office/drawing/2015/10/21/chartex" xmlns:cx3="http://schemas.microsoft.com/office/drawing/2016/5/9/chartex" xmlns:cx4="http://schemas.microsoft.com/office/drawing/2016/5/10/chartex" xmlns:cx5="http://schemas.microsoft.com/office/drawing/2016/5/11/chartex" xmlns:cx6="http://schemas.microsoft.com/office/drawing/2016/5/12/chartex" xmlns:cx7="http://schemas.microsoft.com/office/drawing/2016/5/13/chartex" xmlns:cx8="http://schemas.microsoft.com/office/drawing/2016/5/14/chartex" xmlns:mc="http://schemas.openxmlformats.org/markup-compatibility/2006" xmlns:aink="http://schemas.microsoft.com/office/drawing/2016/ink" xmlns:am3d="http://schemas.microsoft.com/office/drawing/2017/model3d" xmlns:o="urn:schemas-microsoft-com:office:office" xmlns:oel="http://schemas.microsoft.com/office/2019/extlst" xmlns:r="http://schemas.openxmlformats.org/officeDocument/2006/relationships" xmlns:m="http://schemas.openxmlformats.org/officeDocument/2006/math" xmlns:v="urn:schemas-microsoft-com:vml" xmlns:wp14="http://schemas.microsoft.com/office/word/2010/wordprocessingDrawing" xmlns:wp="http://schemas.openxmlformats.org/drawingml/2006/wordprocessingDrawing" xmlns:w10="urn:schemas-microsoft-com:office:word" xmlns:w="http://schemas.openxmlformats.org/wordprocessingml/2006/main" xmlns:w14="http://schemas.microsoft.com/office/word/2010/wordml" xmlns:w15="http://schemas.microsoft.com/office/word/2012/wordml" xmlns:w16cex="http://schemas.microsoft.com/office/word/2018/wordml/cex" xmlns:w16cid="http://schemas.microsoft.com/office/word/2016/wordml/cid" xmlns:w16="http://schemas.microsoft.com/office/word/2018/wordml" xmlns:w16du="http://schemas.microsoft.com/office/word/2023/wordml/word16du" xmlns:w16sdtdh="http://schemas.microsoft.com/office/word/2020/wordml/sdtdatahash" xmlns:w16sdtfl="http://schemas.microsoft.com/office/word/2024/wordml/sdtformatlock" xmlns:w16se="http://schemas.microsoft.com/office/word/2015/wordml/symex" xmlns:wpg="http://schemas.microsoft.com/office/word/2010/wordprocessingGroup" xmlns:wpi="http://schemas.microsoft.com/office/word/2010/wordprocessingInk" xmlns:wne="http://schemas.microsoft.com/office/word/2006/wordml" xmlns:wps="http://schemas.microsoft.com/office/word/2010/wordprocessingShape" mc:Ignorable="w14 w15 w16se w16cid w16 w16cex w16sdtdh w16sdtfl w16du wp14">
+<w:footnotes xmlns:wpc="http://schemas.microsoft.com/office/word/2010/wordprocessingCanvas" xmlns:cx="http://schemas.microsoft.com/office/drawing/2014/chartex" xmlns:cx1="http://schemas.microsoft.com/office/drawing/2015/9/8/chartex" xmlns:cx2="http://schemas.microsoft.com/office/drawing/2015/10/21/chartex" xmlns:cx3="http://schemas.microsoft.com/office/drawing/2016/5/9/chartex" xmlns:cx4="http://schemas.microsoft.com/office/drawing/2016/5/10/chartex" xmlns:cx5="http://schemas.microsoft.com/office/drawing/2016/5/11/chartex" xmlns:cx6="http://schemas.microsoft.com/office/drawing/2016/5/12/chartex" xmlns:cx7="http://schemas.microsoft.com/office/drawing/2016/5/13/chartex" xmlns:cx8="http://schemas.microsoft.com/office/drawing/2016/5/14/chartex" xmlns:mc="http://schemas.openxmlformats.org/markup-compatibility/2006" xmlns:aink="http://schemas.microsoft.com/office/drawing/2016/ink" xmlns:am3d="http://schemas.microsoft.com/office/drawing/2017/model3d" xmlns:o="urn:schemas-microsoft-com:office:office" xmlns:oel="http://schemas.microsoft.com/office/2019/extlst" xmlns:r="http://schemas.openxmlformats.org/officeDocument/2006/relationships" xmlns:m="http://schemas.openxmlformats.org/officeDocument/2006/math" xmlns:v="urn:schemas-microsoft-com:vml" xmlns:wp14="http://schemas.microsoft.com/office/word/2010/wordprocessingDrawing" xmlns:wp="http://schemas.openxmlformats.org/drawingml/2006/wordprocessingDrawing" xmlns:w10="urn:schemas-microsoft-com:office:word" xmlns:w="http://schemas.openxmlformats.org/wordprocessingml/2006/main" xmlns:w14="http://schemas.microsoft.com/office/word/2010/wordml" xmlns:w15="http://schemas.microsoft.com/office/word/2012/wordml" xmlns:w16cex="http://schemas.microsoft.com/office/word/2018/wordml/cex" xmlns:w16cid="http://schemas.microsoft.com/office/word/2016/wordml/cid" xmlns:w16="http://schemas.microsoft.com/office/word/2018/wordml" xmlns:w16sdtdh="http://schemas.microsoft.com/office/word/2020/wordml/sdtdatahash" xmlns:w16se="http://schemas.microsoft.com/office/word/2015/wordml/symex" xmlns:wpg="http://schemas.microsoft.com/office/word/2010/wordprocessingGroup" xmlns:wpi="http://schemas.microsoft.com/office/word/2010/wordprocessingInk" xmlns:wne="http://schemas.microsoft.com/office/word/2006/wordml" xmlns:wps="http://schemas.microsoft.com/office/word/2010/wordprocessingShape" mc:Ignorable="w14 w15 w16se w16cid w16 w16cex w16sdtdh wp14">
   <w:footnote w:type="separator" w:id="-1">
     <w:p>
       <w:r>
@@ -1631,17 +1177,6 @@
     </w:p>
   </w:footnote>
   <w:footnote w:id="1">
-    <w:p>
-      <w:pPr>
-        <w:pStyle w:val="DipnotMetni"/>
-        <w:jc w:val="both"/>
-        <w:rPr>
-          <w:i/>
-        </w:rPr>
-      </w:pPr>
-    </w:p>
-  </w:footnote>
-  <w:footnote w:id="2">
     <w:p>
       <w:pPr>
         <w:pStyle w:val="DipnotMetni"/>
@@ -1653,7 +1188,7 @@
 </file>
 
 <file path=word/numbering.xml><?xml version="1.0" encoding="utf-8"?>
-<w:numbering xmlns:wpc="http://schemas.microsoft.com/office/word/2010/wordprocessingCanvas" xmlns:cx="http://schemas.microsoft.com/office/drawing/2014/chartex" xmlns:cx1="http://schemas.microsoft.com/office/drawing/2015/9/8/chartex" xmlns:cx2="http://schemas.microsoft.com/office/drawing/2015/10/21/chartex" xmlns:cx3="http://schemas.microsoft.com/office/drawing/2016/5/9/chartex" xmlns:cx4="http://schemas.microsoft.com/office/drawing/2016/5/10/chartex" xmlns:cx5="http://schemas.microsoft.com/office/drawing/2016/5/11/chartex" xmlns:cx6="http://schemas.microsoft.com/office/drawing/2016/5/12/chartex" xmlns:cx7="http://schemas.microsoft.com/office/drawing/2016/5/13/chartex" xmlns:cx8="http://schemas.microsoft.com/office/drawing/2016/5/14/chartex" xmlns:mc="http://schemas.openxmlformats.org/markup-compatibility/2006" xmlns:aink="http://schemas.microsoft.com/office/drawing/2016/ink" xmlns:am3d="http://schemas.microsoft.com/office/drawing/2017/model3d" xmlns:o="urn:schemas-microsoft-com:office:office" xmlns:oel="http://schemas.microsoft.com/office/2019/extlst" xmlns:r="http://schemas.openxmlformats.org/officeDocument/2006/relationships" xmlns:m="http://schemas.openxmlformats.org/officeDocument/2006/math" xmlns:v="urn:schemas-microsoft-com:vml" xmlns:wp14="http://schemas.microsoft.com/office/word/2010/wordprocessingDrawing" xmlns:wp="http://schemas.openxmlformats.org/drawingml/2006/wordprocessingDrawing" xmlns:w10="urn:schemas-microsoft-com:office:word" xmlns:w="http://schemas.openxmlformats.org/wordprocessingml/2006/main" xmlns:w14="http://schemas.microsoft.com/office/word/2010/wordml" xmlns:w15="http://schemas.microsoft.com/office/word/2012/wordml" xmlns:w16cex="http://schemas.microsoft.com/office/word/2018/wordml/cex" xmlns:w16cid="http://schemas.microsoft.com/office/word/2016/wordml/cid" xmlns:w16="http://schemas.microsoft.com/office/word/2018/wordml" xmlns:w16du="http://schemas.microsoft.com/office/word/2023/wordml/word16du" xmlns:w16sdtdh="http://schemas.microsoft.com/office/word/2020/wordml/sdtdatahash" xmlns:w16sdtfl="http://schemas.microsoft.com/office/word/2024/wordml/sdtformatlock" xmlns:w16se="http://schemas.microsoft.com/office/word/2015/wordml/symex" xmlns:wpg="http://schemas.microsoft.com/office/word/2010/wordprocessingGroup" xmlns:wpi="http://schemas.microsoft.com/office/word/2010/wordprocessingInk" xmlns:wne="http://schemas.microsoft.com/office/word/2006/wordml" xmlns:wps="http://schemas.microsoft.com/office/word/2010/wordprocessingShape" mc:Ignorable="w14 w15 w16se w16cid w16 w16cex w16sdtdh w16sdtfl w16du wp14">
+<w:numbering xmlns:wpc="http://schemas.microsoft.com/office/word/2010/wordprocessingCanvas" xmlns:cx="http://schemas.microsoft.com/office/drawing/2014/chartex" xmlns:cx1="http://schemas.microsoft.com/office/drawing/2015/9/8/chartex" xmlns:cx2="http://schemas.microsoft.com/office/drawing/2015/10/21/chartex" xmlns:cx3="http://schemas.microsoft.com/office/drawing/2016/5/9/chartex" xmlns:cx4="http://schemas.microsoft.com/office/drawing/2016/5/10/chartex" xmlns:cx5="http://schemas.microsoft.com/office/drawing/2016/5/11/chartex" xmlns:cx6="http://schemas.microsoft.com/office/drawing/2016/5/12/chartex" xmlns:cx7="http://schemas.microsoft.com/office/drawing/2016/5/13/chartex" xmlns:cx8="http://schemas.microsoft.com/office/drawing/2016/5/14/chartex" xmlns:mc="http://schemas.openxmlformats.org/markup-compatibility/2006" xmlns:aink="http://schemas.microsoft.com/office/drawing/2016/ink" xmlns:am3d="http://schemas.microsoft.com/office/drawing/2017/model3d" xmlns:o="urn:schemas-microsoft-com:office:office" xmlns:oel="http://schemas.microsoft.com/office/2019/extlst" xmlns:r="http://schemas.openxmlformats.org/officeDocument/2006/relationships" xmlns:m="http://schemas.openxmlformats.org/officeDocument/2006/math" xmlns:v="urn:schemas-microsoft-com:vml" xmlns:wp14="http://schemas.microsoft.com/office/word/2010/wordprocessingDrawing" xmlns:wp="http://schemas.openxmlformats.org/drawingml/2006/wordprocessingDrawing" xmlns:w10="urn:schemas-microsoft-com:office:word" xmlns:w="http://schemas.openxmlformats.org/wordprocessingml/2006/main" xmlns:w14="http://schemas.microsoft.com/office/word/2010/wordml" xmlns:w15="http://schemas.microsoft.com/office/word/2012/wordml" xmlns:w16cex="http://schemas.microsoft.com/office/word/2018/wordml/cex" xmlns:w16cid="http://schemas.microsoft.com/office/word/2016/wordml/cid" xmlns:w16="http://schemas.microsoft.com/office/word/2018/wordml" xmlns:w16sdtdh="http://schemas.microsoft.com/office/word/2020/wordml/sdtdatahash" xmlns:w16se="http://schemas.microsoft.com/office/word/2015/wordml/symex" xmlns:wpg="http://schemas.microsoft.com/office/word/2010/wordprocessingGroup" xmlns:wpi="http://schemas.microsoft.com/office/word/2010/wordprocessingInk" xmlns:wne="http://schemas.microsoft.com/office/word/2006/wordml" xmlns:wps="http://schemas.microsoft.com/office/word/2010/wordprocessingShape" mc:Ignorable="w14 w15 w16se w16cid w16 w16cex w16sdtdh wp14">
   <w:abstractNum w:abstractNumId="0" w15:restartNumberingAfterBreak="0">
     <w:nsid w:val="08542E65"/>
     <w:multiLevelType w:val="singleLevel"/>
@@ -1704,7 +1239,7 @@
 </file>
 
 <file path=word/styles.xml><?xml version="1.0" encoding="utf-8"?>
-<w:styles xmlns:mc="http://schemas.openxmlformats.org/markup-compatibility/2006" xmlns:r="http://schemas.openxmlformats.org/officeDocument/2006/relationships" xmlns:w="http://schemas.openxmlformats.org/wordprocessingml/2006/main" xmlns:w14="http://schemas.microsoft.com/office/word/2010/wordml" xmlns:w15="http://schemas.microsoft.com/office/word/2012/wordml" xmlns:w16cex="http://schemas.microsoft.com/office/word/2018/wordml/cex" xmlns:w16cid="http://schemas.microsoft.com/office/word/2016/wordml/cid" xmlns:w16="http://schemas.microsoft.com/office/word/2018/wordml" xmlns:w16du="http://schemas.microsoft.com/office/word/2023/wordml/word16du" xmlns:w16sdtdh="http://schemas.microsoft.com/office/word/2020/wordml/sdtdatahash" xmlns:w16sdtfl="http://schemas.microsoft.com/office/word/2024/wordml/sdtformatlock" xmlns:w16se="http://schemas.microsoft.com/office/word/2015/wordml/symex" mc:Ignorable="w14 w15 w16se w16cid w16 w16cex w16sdtdh w16sdtfl w16du">
+<w:styles xmlns:mc="http://schemas.openxmlformats.org/markup-compatibility/2006" xmlns:r="http://schemas.openxmlformats.org/officeDocument/2006/relationships" xmlns:w="http://schemas.openxmlformats.org/wordprocessingml/2006/main" xmlns:w14="http://schemas.microsoft.com/office/word/2010/wordml" xmlns:w15="http://schemas.microsoft.com/office/word/2012/wordml" xmlns:w16cex="http://schemas.microsoft.com/office/word/2018/wordml/cex" xmlns:w16cid="http://schemas.microsoft.com/office/word/2016/wordml/cid" xmlns:w16="http://schemas.microsoft.com/office/word/2018/wordml" xmlns:w16sdtdh="http://schemas.microsoft.com/office/word/2020/wordml/sdtdatahash" xmlns:w16se="http://schemas.microsoft.com/office/word/2015/wordml/symex" mc:Ignorable="w14 w15 w16se w16cid w16 w16cex w16sdtdh">
   <w:docDefaults>
     <w:rPrDefault>
       <w:rPr>
@@ -2103,6 +1638,7 @@
   <w:style w:type="character" w:default="1" w:styleId="VarsaylanParagrafYazTipi">
     <w:name w:val="Default Paragraph Font"/>
     <w:uiPriority w:val="1"/>
+    <w:semiHidden/>
     <w:unhideWhenUsed/>
   </w:style>
   <w:style w:type="table" w:default="1" w:styleId="NormalTablo">

</xml_diff>